<commit_message>
creación csv datos limpios
</commit_message>
<xml_diff>
--- a/Enunciado_ Proyecto EDA con Python.docx
+++ b/Enunciado_ Proyecto EDA con Python.docx
@@ -145,13 +145,8 @@
         <w:ind w:firstLine="720"/>
       </w:pPr>
       <w:r>
-        <w:t xml:space="preserve">● Visual Studio </w:t>
-      </w:r>
-      <w:proofErr w:type="spellStart"/>
-      <w:r>
-        <w:t>Code</w:t>
-      </w:r>
-      <w:proofErr w:type="spellEnd"/>
+        <w:t>● Visual Studio Code</w:t>
+      </w:r>
     </w:p>
     <w:p>
       <w:pPr>

</xml_diff>